<commit_message>
Respuesta a Paula: version final con comprobante en la separacion
Co-Authored-By: Claude Fable 5.1 <noreply@anthropic.com>
</commit_message>
<xml_diff>
--- a/recursos/comercial/INDUCCION_COMERCIAL/RESPUESTA_PAULA_DUDAS_24SEP.docx
+++ b/recursos/comercial/INDUCCION_COMERCIAL/RESPUESTA_PAULA_DUDAS_24SEP.docx
@@ -512,7 +512,7 @@
               <w:rPr>
                 <w:sz w:val="19"/>
               </w:rPr>
-              <w:t>Transfiere $300.000 a las cuentas oficiales de la academia (te paso los datos con el kit). Nunca efectivo por fuera de la sede, nunca a cuentas personales.</w:t>
+              <w:t>Transfiere $300.000 a las cuentas oficiales de la academia (te paso los datos con el kit) y te envía el pantallazo del comprobante. Nunca efectivo por fuera de la sede, nunca a cuentas personales.</w:t>
             </w:r>
           </w:p>
         </w:tc>
@@ -616,7 +616,7 @@
               <w:rPr>
                 <w:sz w:val="19"/>
               </w:rPr>
-              <w:t>Responde por escrito "ACEPTO las condiciones del recibo No. X", con la foto de su cédula y el comprobante de la transferencia. Ese mensaje tiene validez legal.</w:t>
+              <w:t>Responde por escrito "ACEPTO las condiciones del recibo No. X", con la foto de su cédula. Junto con el pantallazo del comprobante, ese mensaje tiene validez legal.</w:t>
             </w:r>
           </w:p>
         </w:tc>

</xml_diff>